<commit_message>
Revise English text, add Paris and Alexandria, start Spanish version
- Paris.tex: grammar and style revision on top of the automated pass
  (dump/flophouse, love-boy restored, Cavafy, the young, upon the last,
  identical to the others, over the years, verse split in VI, etc.)
- Add Paris and Alexandria as penultimate poem
- Add revision_gramatical.md logging revision decisions and criteria
- Add Paris_es.tex (Postal del Cielo), first fragment: Segunda Ciudad
- Rebuild PDF/DOCX/MD outputs

Co-Authored-By: Claude Fable 5 <noreply@anthropic.com>
Claude-Session: https://claude.ai/code/session_01EM9JGDG4GyuSnBgRv7PmYC
</commit_message>
<xml_diff>
--- a/Paris/Paris.docx
+++ b/Paris/Paris.docx
@@ -38,7 +38,7 @@
         <w:br/>
       </w:r>
       <w:r>
-        <w:t xml:space="preserve">in a disgusting slum, whose name,</w:t>
+        <w:t xml:space="preserve">in a disgusting dump, whose name,</w:t>
       </w:r>
       <w:r>
         <w:br/>
@@ -54,7 +54,7 @@
         <w:br/>
       </w:r>
       <w:r>
-        <w:t xml:space="preserve">did not advertise the common bedroom, smelly</w:t>
+        <w:t xml:space="preserve">did not advertise the common bedroom, smelling</w:t>
       </w:r>
       <w:r>
         <w:br/>
@@ -72,7 +72,7 @@
         <w:br/>
       </w:r>
       <w:r>
-        <w:t xml:space="preserve">even that sleepless night in the barracks,</w:t>
+        <w:t xml:space="preserve">and even that sleepless night in the barracks</w:t>
       </w:r>
       <w:r>
         <w:br/>
@@ -134,7 +134,7 @@
         <w:br/>
       </w:r>
       <w:r>
-        <w:t xml:space="preserve">with the capitals letters of youth.</w:t>
+        <w:t xml:space="preserve">with the capital letters of youth.</w:t>
       </w:r>
     </w:p>
     <w:p>
@@ -148,7 +148,7 @@
         <w:br/>
       </w:r>
       <w:r>
-        <w:t xml:space="preserve">bright and fuzzy, like a Kandinsky’s,</w:t>
+        <w:t xml:space="preserve">bright and fuzzy, like a Kandinsky,</w:t>
       </w:r>
       <w:r>
         <w:br/>
@@ -160,29 +160,29 @@
         <w:br/>
       </w:r>
       <w:r>
-        <w:t xml:space="preserve">the illusion of false factory, as if a dream.</w:t>
-      </w:r>
-    </w:p>
-    <w:p>
-      <w:pPr>
-        <w:pStyle w:val="BodyText"/>
-      </w:pPr>
-      <w:r>
-        <w:t xml:space="preserve">Amazing to realise that once,</w:t>
-      </w:r>
-      <w:r>
-        <w:br/>
-      </w:r>
-      <w:r>
-        <w:t xml:space="preserve">I too, was happy in Paris.</w:t>
-      </w:r>
-    </w:p>
-    <w:p>
-      <w:pPr>
-        <w:pStyle w:val="BodyText"/>
-      </w:pPr>
-      <w:r>
-        <w:t xml:space="preserve">Not that the city has changed so much since then,</w:t>
+        <w:t xml:space="preserve">the illusion of a false factory, as if a dream.</w:t>
+      </w:r>
+    </w:p>
+    <w:p>
+      <w:pPr>
+        <w:pStyle w:val="BodyText"/>
+      </w:pPr>
+      <w:r>
+        <w:t xml:space="preserve">Amazing to realise that once</w:t>
+      </w:r>
+      <w:r>
+        <w:br/>
+      </w:r>
+      <w:r>
+        <w:t xml:space="preserve">I too was happy in Paris.</w:t>
+      </w:r>
+    </w:p>
+    <w:p>
+      <w:pPr>
+        <w:pStyle w:val="BodyText"/>
+      </w:pPr>
+      <w:r>
+        <w:t xml:space="preserve">Not that the city has changed so much since then.</w:t>
       </w:r>
       <w:r>
         <w:br/>
@@ -194,7 +194,7 @@
         <w:br/>
       </w:r>
       <w:r>
-        <w:t xml:space="preserve">as the stalls of old booksellers,</w:t>
+        <w:t xml:space="preserve">along with the stalls of old booksellers</w:t>
       </w:r>
       <w:r>
         <w:br/>
@@ -254,7 +254,7 @@
         <w:pStyle w:val="BodyText"/>
       </w:pPr>
       <w:r>
-        <w:t xml:space="preserve">You are twenty only once, naive enough to believe,</w:t>
+        <w:t xml:space="preserve">You are twenty only once, naive enough to believe</w:t>
       </w:r>
       <w:r>
         <w:br/>
@@ -266,7 +266,7 @@
         <w:br/>
       </w:r>
       <w:r>
-        <w:t xml:space="preserve">just for us. It didn’t cross my mind, how cliché was,</w:t>
+        <w:t xml:space="preserve">just for us. It didn’t cross my mind what a cliché it was,</w:t>
       </w:r>
       <w:r>
         <w:br/>
@@ -296,13 +296,13 @@
         <w:br/>
       </w:r>
       <w:r>
-        <w:t xml:space="preserve">and the giant mirror that repeated,</w:t>
-      </w:r>
-      <w:r>
-        <w:br/>
-      </w:r>
-      <w:r>
-        <w:t xml:space="preserve">the entanglement our lithe bodies.</w:t>
+        <w:t xml:space="preserve">and the giant mirror that repeated</w:t>
+      </w:r>
+      <w:r>
+        <w:br/>
+      </w:r>
+      <w:r>
+        <w:t xml:space="preserve">the entanglement of our lithe bodies.</w:t>
       </w:r>
     </w:p>
     <w:p>
@@ -316,7 +316,7 @@
         <w:br/>
       </w:r>
       <w:r>
-        <w:t xml:space="preserve">read Baudelaire and Kavafis to each other,</w:t>
+        <w:t xml:space="preserve">read Baudelaire and Cavafy to each other,</w:t>
       </w:r>
       <w:r>
         <w:br/>
@@ -334,7 +334,7 @@
         <w:br/>
       </w:r>
       <w:r>
-        <w:t xml:space="preserve">we believed that spring,</w:t>
+        <w:t xml:space="preserve">and we believed that spring</w:t>
       </w:r>
       <w:r>
         <w:br/>
@@ -358,19 +358,19 @@
         <w:pStyle w:val="FirstParagraph"/>
       </w:pPr>
       <w:r>
-        <w:t xml:space="preserve">The first city,</w:t>
-      </w:r>
-      <w:r>
-        <w:br/>
-      </w:r>
-      <w:r>
-        <w:t xml:space="preserve">exists before you ever set foot in Paris,</w:t>
-      </w:r>
-      <w:r>
-        <w:br/>
-      </w:r>
-      <w:r>
-        <w:t xml:space="preserve">it is made of the stuff of dreams,</w:t>
+        <w:t xml:space="preserve">The first city</w:t>
+      </w:r>
+      <w:r>
+        <w:br/>
+      </w:r>
+      <w:r>
+        <w:t xml:space="preserve">exists before you ever set foot in Paris.</w:t>
+      </w:r>
+      <w:r>
+        <w:br/>
+      </w:r>
+      <w:r>
+        <w:t xml:space="preserve">It is made of the stuff of dreams,</w:t>
       </w:r>
       <w:r>
         <w:br/>
@@ -406,7 +406,7 @@
         <w:br/>
       </w:r>
       <w:r>
-        <w:t xml:space="preserve">repeated by the poets and the singers,</w:t>
+        <w:t xml:space="preserve">repeated by poets and singers,</w:t>
       </w:r>
       <w:r>
         <w:br/>
@@ -418,7 +418,7 @@
         <w:br/>
       </w:r>
       <w:r>
-        <w:t xml:space="preserve">The first city is imagined, and yet,</w:t>
+        <w:t xml:space="preserve">The first city is imagined, and yet</w:t>
       </w:r>
       <w:r>
         <w:br/>
@@ -436,7 +436,7 @@
         <w:br/>
       </w:r>
       <w:r>
-        <w:t xml:space="preserve">Paris never was. It was conjured,</w:t>
+        <w:t xml:space="preserve">Paris never was. It was conjured</w:t>
       </w:r>
       <w:r>
         <w:br/>
@@ -472,7 +472,7 @@
         <w:pStyle w:val="FirstParagraph"/>
       </w:pPr>
       <w:r>
-        <w:t xml:space="preserve">You did not visited either the second city,</w:t>
+        <w:t xml:space="preserve">You did not visit the second city either,</w:t>
       </w:r>
       <w:r>
         <w:br/>
@@ -484,13 +484,13 @@
         <w:br/>
       </w:r>
       <w:r>
-        <w:t xml:space="preserve">madly in love, without realizing,</w:t>
-      </w:r>
-      <w:r>
-        <w:br/>
-      </w:r>
-      <w:r>
-        <w:t xml:space="preserve">that you were inventing both, love and Paris.</w:t>
+        <w:t xml:space="preserve">madly in love, without realizing</w:t>
+      </w:r>
+      <w:r>
+        <w:br/>
+      </w:r>
+      <w:r>
+        <w:t xml:space="preserve">that you were inventing both love and Paris.</w:t>
       </w:r>
     </w:p>
     <w:p>
@@ -528,7 +528,7 @@
         <w:br/>
       </w:r>
       <w:r>
-        <w:t xml:space="preserve">the ocasional stolen sandwich, playing bohemian,</w:t>
+        <w:t xml:space="preserve">the occasional stolen sandwich, playing bohemian,</w:t>
       </w:r>
       <w:r>
         <w:br/>
@@ -542,25 +542,25 @@
         <w:pStyle w:val="BodyText"/>
       </w:pPr>
       <w:r>
-        <w:t xml:space="preserve">All of that,</w:t>
-      </w:r>
-      <w:r>
-        <w:br/>
-      </w:r>
-      <w:r>
-        <w:t xml:space="preserve">was just the plot of a soap opera,</w:t>
-      </w:r>
-      <w:r>
-        <w:br/>
-      </w:r>
-      <w:r>
-        <w:t xml:space="preserve">the city was crowded with people repeating the same lines,</w:t>
-      </w:r>
-      <w:r>
-        <w:br/>
-      </w:r>
-      <w:r>
-        <w:t xml:space="preserve">and yet, no one realised. All the other million couples,</w:t>
+        <w:t xml:space="preserve">All of that</w:t>
+      </w:r>
+      <w:r>
+        <w:br/>
+      </w:r>
+      <w:r>
+        <w:t xml:space="preserve">was just the plot of a soap opera.</w:t>
+      </w:r>
+      <w:r>
+        <w:br/>
+      </w:r>
+      <w:r>
+        <w:t xml:space="preserve">The city was crowded with people repeating the same lines,</w:t>
+      </w:r>
+      <w:r>
+        <w:br/>
+      </w:r>
+      <w:r>
+        <w:t xml:space="preserve">and yet no one realised. All the other million couples,</w:t>
       </w:r>
       <w:r>
         <w:br/>
@@ -584,25 +584,25 @@
         <w:br/>
       </w:r>
       <w:r>
-        <w:t xml:space="preserve">all were invisible to you, under the blinding light,</w:t>
-      </w:r>
-      <w:r>
-        <w:br/>
-      </w:r>
-      <w:r>
-        <w:t xml:space="preserve">of your twenty years. You never travel to Paris at that age,</w:t>
-      </w:r>
-      <w:r>
-        <w:br/>
-      </w:r>
-      <w:r>
-        <w:t xml:space="preserve">it could have been Viena, or Rome, Tel Aviv or Prague,</w:t>
-      </w:r>
-      <w:r>
-        <w:br/>
-      </w:r>
-      <w:r>
-        <w:t xml:space="preserve">you just travel to the city of your youth.</w:t>
+        <w:t xml:space="preserve">all were invisible to you, under the blinding light</w:t>
+      </w:r>
+      <w:r>
+        <w:br/>
+      </w:r>
+      <w:r>
+        <w:t xml:space="preserve">of your twenty years. You never travel to Paris at that age.</w:t>
+      </w:r>
+      <w:r>
+        <w:br/>
+      </w:r>
+      <w:r>
+        <w:t xml:space="preserve">It could have been Vienna, or Rome, Tel Aviv or Prague.</w:t>
+      </w:r>
+      <w:r>
+        <w:br/>
+      </w:r>
+      <w:r>
+        <w:t xml:space="preserve">You just travel to the city of your youth.</w:t>
       </w:r>
     </w:p>
     <w:bookmarkEnd w:id="11"/>
@@ -626,13 +626,13 @@
         <w:br/>
       </w:r>
       <w:r>
-        <w:t xml:space="preserve">each one piling above the previous,</w:t>
-      </w:r>
-      <w:r>
-        <w:br/>
-      </w:r>
-      <w:r>
-        <w:t xml:space="preserve">ordered in time, like archeological layers,</w:t>
+        <w:t xml:space="preserve">each one piling upon the last,</w:t>
+      </w:r>
+      <w:r>
+        <w:br/>
+      </w:r>
+      <w:r>
+        <w:t xml:space="preserve">ordered in time, like archaeological layers,</w:t>
       </w:r>
       <w:r>
         <w:br/>
@@ -652,7 +652,7 @@
         <w:pStyle w:val="BodyText"/>
       </w:pPr>
       <w:r>
-        <w:t xml:space="preserve">You return to Paris so often across the years,</w:t>
+        <w:t xml:space="preserve">You return to Paris so often over the years,</w:t>
       </w:r>
       <w:r>
         <w:br/>
@@ -672,19 +672,19 @@
         <w:pStyle w:val="BodyText"/>
       </w:pPr>
       <w:r>
-        <w:t xml:space="preserve">The magic is gone, yet,</w:t>
-      </w:r>
-      <w:r>
-        <w:br/>
-      </w:r>
-      <w:r>
-        <w:t xml:space="preserve">a good feeling persists,</w:t>
-      </w:r>
-      <w:r>
-        <w:br/>
-      </w:r>
-      <w:r>
-        <w:t xml:space="preserve">you become a friend of the same streets,</w:t>
+        <w:t xml:space="preserve">The magic is gone, yet</w:t>
+      </w:r>
+      <w:r>
+        <w:br/>
+      </w:r>
+      <w:r>
+        <w:t xml:space="preserve">a good feeling persists.</w:t>
+      </w:r>
+      <w:r>
+        <w:br/>
+      </w:r>
+      <w:r>
+        <w:t xml:space="preserve">You become a friend of the same streets,</w:t>
       </w:r>
       <w:r>
         <w:br/>
@@ -710,25 +710,25 @@
         <w:br/>
       </w:r>
       <w:r>
-        <w:t xml:space="preserve">there is among both of you the intimacy,</w:t>
-      </w:r>
-      <w:r>
-        <w:br/>
-      </w:r>
-      <w:r>
-        <w:t xml:space="preserve">which only gives the memory of naked bodies,</w:t>
-      </w:r>
-      <w:r>
-        <w:br/>
-      </w:r>
-      <w:r>
-        <w:t xml:space="preserve">under clean sheets. Yet the passion has passed,</w:t>
-      </w:r>
-      <w:r>
-        <w:br/>
-      </w:r>
-      <w:r>
-        <w:t xml:space="preserve">you see wrinkles and decay where once,</w:t>
+        <w:t xml:space="preserve">there is between you both the intimacy,</w:t>
+      </w:r>
+      <w:r>
+        <w:br/>
+      </w:r>
+      <w:r>
+        <w:t xml:space="preserve">which only gives the memory of naked bodies</w:t>
+      </w:r>
+      <w:r>
+        <w:br/>
+      </w:r>
+      <w:r>
+        <w:t xml:space="preserve">under clean sheets. Yet the passion has passed.</w:t>
+      </w:r>
+      <w:r>
+        <w:br/>
+      </w:r>
+      <w:r>
+        <w:t xml:space="preserve">You see wrinkles and decay where once</w:t>
       </w:r>
       <w:r>
         <w:br/>
@@ -758,7 +758,7 @@
         <w:br/>
       </w:r>
       <w:r>
-        <w:t xml:space="preserve">and all the angels of Heaven,</w:t>
+        <w:t xml:space="preserve">and all the angels of Heaven</w:t>
       </w:r>
       <w:r>
         <w:br/>
@@ -772,19 +772,19 @@
         <w:pStyle w:val="BodyText"/>
       </w:pPr>
       <w:r>
-        <w:t xml:space="preserve">You walk Paris again, they are by your side,</w:t>
-      </w:r>
-      <w:r>
-        <w:br/>
-      </w:r>
-      <w:r>
-        <w:t xml:space="preserve">your girl is eleven, and she carries the map,</w:t>
-      </w:r>
-      <w:r>
-        <w:br/>
-      </w:r>
-      <w:r>
-        <w:t xml:space="preserve">to sail the hostile underground and ensure,</w:t>
+        <w:t xml:space="preserve">You walk Paris again. They are by your side.</w:t>
+      </w:r>
+      <w:r>
+        <w:br/>
+      </w:r>
+      <w:r>
+        <w:t xml:space="preserve">Your girl is eleven, and she carries the map</w:t>
+      </w:r>
+      <w:r>
+        <w:br/>
+      </w:r>
+      <w:r>
+        <w:t xml:space="preserve">to sail the hostile underground and ensure</w:t>
       </w:r>
       <w:r>
         <w:br/>
@@ -796,7 +796,7 @@
         <w:br/>
       </w:r>
       <w:r>
-        <w:t xml:space="preserve">Daddy won’t find his way, he is half blind,</w:t>
+        <w:t xml:space="preserve">Daddy won’t find his way. He is half blind</w:t>
       </w:r>
       <w:r>
         <w:br/>
@@ -808,33 +808,33 @@
         <w:br/>
       </w:r>
       <w:r>
-        <w:t xml:space="preserve">of the Subway.</w:t>
-      </w:r>
-    </w:p>
-    <w:p>
-      <w:pPr>
-        <w:pStyle w:val="BodyText"/>
-      </w:pPr>
-      <w:r>
-        <w:t xml:space="preserve">So she is taking care of you, firmly,</w:t>
-      </w:r>
-      <w:r>
-        <w:br/>
-      </w:r>
-      <w:r>
-        <w:t xml:space="preserve">holding your hand. But your son’s grip,</w:t>
-      </w:r>
-      <w:r>
-        <w:br/>
-      </w:r>
-      <w:r>
-        <w:t xml:space="preserve">is even stronger. He is seven, his job,</w:t>
-      </w:r>
-      <w:r>
-        <w:br/>
-      </w:r>
-      <w:r>
-        <w:t xml:space="preserve">is to be your bodyguard. His stern gaze,</w:t>
+        <w:t xml:space="preserve">of the subway.</w:t>
+      </w:r>
+    </w:p>
+    <w:p>
+      <w:pPr>
+        <w:pStyle w:val="BodyText"/>
+      </w:pPr>
+      <w:r>
+        <w:t xml:space="preserve">So she is taking care of you,</w:t>
+      </w:r>
+      <w:r>
+        <w:br/>
+      </w:r>
+      <w:r>
+        <w:t xml:space="preserve">holding your hand firmly. But your son’s grip</w:t>
+      </w:r>
+      <w:r>
+        <w:br/>
+      </w:r>
+      <w:r>
+        <w:t xml:space="preserve">is even stronger. He is seven. His job</w:t>
+      </w:r>
+      <w:r>
+        <w:br/>
+      </w:r>
+      <w:r>
+        <w:t xml:space="preserve">is to be your bodyguard. His stern gaze</w:t>
       </w:r>
       <w:r>
         <w:br/>
@@ -848,13 +848,13 @@
         <w:pStyle w:val="BodyText"/>
       </w:pPr>
       <w:r>
-        <w:t xml:space="preserve">All the sudden,</w:t>
-      </w:r>
-      <w:r>
-        <w:br/>
-      </w:r>
-      <w:r>
-        <w:t xml:space="preserve">Your eyes are open again,</w:t>
+        <w:t xml:space="preserve">Suddenly,</w:t>
+      </w:r>
+      <w:r>
+        <w:br/>
+      </w:r>
+      <w:r>
+        <w:t xml:space="preserve">your eyes are open again,</w:t>
       </w:r>
       <w:r>
         <w:br/>
@@ -878,13 +878,13 @@
         <w:br/>
       </w:r>
       <w:r>
-        <w:t xml:space="preserve">but something so deep and burning,</w:t>
-      </w:r>
-      <w:r>
-        <w:br/>
-      </w:r>
-      <w:r>
-        <w:t xml:space="preserve">that the city becomes real,</w:t>
+        <w:t xml:space="preserve">but something so deep and burning</w:t>
+      </w:r>
+      <w:r>
+        <w:br/>
+      </w:r>
+      <w:r>
+        <w:t xml:space="preserve">that the city becomes real</w:t>
       </w:r>
       <w:r>
         <w:br/>
@@ -914,19 +914,19 @@
         <w:br/>
       </w:r>
       <w:r>
-        <w:t xml:space="preserve">as an old man. There is something in the air,</w:t>
-      </w:r>
-      <w:r>
-        <w:br/>
-      </w:r>
-      <w:r>
-        <w:t xml:space="preserve">that rejects you, the old covenant, good for so long,</w:t>
-      </w:r>
-      <w:r>
-        <w:br/>
-      </w:r>
-      <w:r>
-        <w:t xml:space="preserve">thorn to pieces.</w:t>
+        <w:t xml:space="preserve">as an old man. There is something in the air</w:t>
+      </w:r>
+      <w:r>
+        <w:br/>
+      </w:r>
+      <w:r>
+        <w:t xml:space="preserve">that rejects you. The old covenant, good for so long,</w:t>
+      </w:r>
+      <w:r>
+        <w:br/>
+      </w:r>
+      <w:r>
+        <w:t xml:space="preserve">is torn to pieces.</w:t>
       </w:r>
     </w:p>
     <w:p>
@@ -943,7 +943,7 @@
         <w:t xml:space="preserve">You still move around,</w:t>
       </w:r>
       <w:r>
-        <w:t xml:space="preserve"> </w:t>
+        <w:br/>
       </w:r>
       <w:r>
         <w:t xml:space="preserve">watching everything and everybody,</w:t>
@@ -952,7 +952,7 @@
         <w:br/>
       </w:r>
       <w:r>
-        <w:t xml:space="preserve">absorbing equally land and people,</w:t>
+        <w:t xml:space="preserve">absorbing land and people alike</w:t>
       </w:r>
       <w:r>
         <w:br/>
@@ -972,7 +972,7 @@
         <w:br/>
       </w:r>
       <w:r>
-        <w:t xml:space="preserve">that burning stare,</w:t>
+        <w:t xml:space="preserve">that burning stare</w:t>
       </w:r>
       <w:r>
         <w:br/>
@@ -990,13 +990,13 @@
         <w:br/>
       </w:r>
       <w:r>
-        <w:t xml:space="preserve">looked back, sometimes,</w:t>
-      </w:r>
-      <w:r>
-        <w:br/>
-      </w:r>
-      <w:r>
-        <w:t xml:space="preserve">sparks flew the night.</w:t>
+        <w:t xml:space="preserve">looked back, sometimes.</w:t>
+      </w:r>
+      <w:r>
+        <w:br/>
+      </w:r>
+      <w:r>
+        <w:t xml:space="preserve">Sparks flew in the night.</w:t>
       </w:r>
     </w:p>
     <w:p>
@@ -1010,19 +1010,19 @@
         <w:br/>
       </w:r>
       <w:r>
-        <w:t xml:space="preserve">you will be taken by a loony,</w:t>
-      </w:r>
-      <w:r>
-        <w:br/>
-      </w:r>
-      <w:r>
-        <w:t xml:space="preserve">or worst, a lecher.</w:t>
-      </w:r>
-      <w:r>
-        <w:br/>
-      </w:r>
-      <w:r>
-        <w:t xml:space="preserve">You need to remind yourself,</w:t>
+        <w:t xml:space="preserve">you will be taken for a loony,</w:t>
+      </w:r>
+      <w:r>
+        <w:br/>
+      </w:r>
+      <w:r>
+        <w:t xml:space="preserve">or worse, a lecher.</w:t>
+      </w:r>
+      <w:r>
+        <w:br/>
+      </w:r>
+      <w:r>
+        <w:t xml:space="preserve">You need to remind yourself</w:t>
       </w:r>
       <w:r>
         <w:br/>
@@ -1034,7 +1034,7 @@
         <w:br/>
       </w:r>
       <w:r>
-        <w:t xml:space="preserve">eye contact with the youth,</w:t>
+        <w:t xml:space="preserve">eye contact with the young,</w:t>
       </w:r>
       <w:r>
         <w:br/>
@@ -1078,43 +1078,43 @@
         <w:pStyle w:val="BodyText"/>
       </w:pPr>
       <w:r>
-        <w:t xml:space="preserve">Your daughter is twenty, still holds you hand,</w:t>
-      </w:r>
-      <w:r>
-        <w:br/>
-      </w:r>
-      <w:r>
-        <w:t xml:space="preserve">talks non-stop about her recent love-boy,</w:t>
-      </w:r>
-      <w:r>
-        <w:br/>
-      </w:r>
-      <w:r>
-        <w:t xml:space="preserve">he is coming to meet her,</w:t>
-      </w:r>
-      <w:r>
-        <w:br/>
-      </w:r>
-      <w:r>
-        <w:t xml:space="preserve">they will walk the same streets,</w:t>
-      </w:r>
-      <w:r>
-        <w:br/>
-      </w:r>
-      <w:r>
-        <w:t xml:space="preserve">and kiss in the same corners,</w:t>
-      </w:r>
-      <w:r>
-        <w:br/>
-      </w:r>
-      <w:r>
-        <w:t xml:space="preserve">that one smiled at you,</w:t>
-      </w:r>
-      <w:r>
-        <w:br/>
-      </w:r>
-      <w:r>
-        <w:t xml:space="preserve">they are inventing, one more time,</w:t>
+        <w:t xml:space="preserve">Your daughter is twenty, still holds your hand,</w:t>
+      </w:r>
+      <w:r>
+        <w:br/>
+      </w:r>
+      <w:r>
+        <w:t xml:space="preserve">talks non-stop about her latest love-boy.</w:t>
+      </w:r>
+      <w:r>
+        <w:br/>
+      </w:r>
+      <w:r>
+        <w:t xml:space="preserve">He is coming to meet her.</w:t>
+      </w:r>
+      <w:r>
+        <w:br/>
+      </w:r>
+      <w:r>
+        <w:t xml:space="preserve">They will walk the same streets,</w:t>
+      </w:r>
+      <w:r>
+        <w:br/>
+      </w:r>
+      <w:r>
+        <w:t xml:space="preserve">and kiss in the same corners</w:t>
+      </w:r>
+      <w:r>
+        <w:br/>
+      </w:r>
+      <w:r>
+        <w:t xml:space="preserve">that once smiled at you.</w:t>
+      </w:r>
+      <w:r>
+        <w:br/>
+      </w:r>
+      <w:r>
+        <w:t xml:space="preserve">They are inventing, one more time,</w:t>
       </w:r>
       <w:r>
         <w:br/>
@@ -1152,25 +1152,25 @@
         <w:br/>
       </w:r>
       <w:r>
-        <w:t xml:space="preserve">want to be a scientist like mom and dad,</w:t>
-      </w:r>
-      <w:r>
-        <w:br/>
-      </w:r>
-      <w:r>
-        <w:t xml:space="preserve">when he was small,</w:t>
-      </w:r>
-      <w:r>
-        <w:br/>
-      </w:r>
-      <w:r>
-        <w:t xml:space="preserve">he wanted to work in the same place,</w:t>
-      </w:r>
-      <w:r>
-        <w:br/>
-      </w:r>
-      <w:r>
-        <w:t xml:space="preserve">that both of you, now,</w:t>
+        <w:t xml:space="preserve">wants to be a scientist like Mom and Dad.</w:t>
+      </w:r>
+      <w:r>
+        <w:br/>
+      </w:r>
+      <w:r>
+        <w:t xml:space="preserve">When he was small,</w:t>
+      </w:r>
+      <w:r>
+        <w:br/>
+      </w:r>
+      <w:r>
+        <w:t xml:space="preserve">he wanted to work in the same place</w:t>
+      </w:r>
+      <w:r>
+        <w:br/>
+      </w:r>
+      <w:r>
+        <w:t xml:space="preserve">as both of you. Now</w:t>
       </w:r>
       <w:r>
         <w:br/>
@@ -1234,7 +1234,7 @@
         <w:br/>
       </w:r>
       <w:r>
-        <w:t xml:space="preserve">as the light of fireflies.</w:t>
+        <w:t xml:space="preserve">like the light of fireflies.</w:t>
       </w:r>
     </w:p>
     <w:p>
@@ -1286,7 +1286,7 @@
         <w:br/>
       </w:r>
       <w:r>
-        <w:t xml:space="preserve">but it can still be,</w:t>
+        <w:t xml:space="preserve">but it can still be</w:t>
       </w:r>
       <w:r>
         <w:br/>
@@ -1296,12 +1296,212 @@
       </w:r>
     </w:p>
     <w:bookmarkEnd w:id="15"/>
-    <w:bookmarkStart w:id="16" w:name="the-clochard"/>
+    <w:bookmarkStart w:id="16" w:name="paris-and-alexandria"/>
     <w:p>
       <w:pPr>
         <w:pStyle w:val="Heading2"/>
       </w:pPr>
       <w:r>
+        <w:t xml:space="preserve">Paris and Alexandria</w:t>
+      </w:r>
+    </w:p>
+    <w:p>
+      <w:pPr>
+        <w:pStyle w:val="FirstParagraph"/>
+      </w:pPr>
+      <w:r>
+        <w:t xml:space="preserve">So must I do as Antony did?</w:t>
+      </w:r>
+      <w:r>
+        <w:br/>
+      </w:r>
+      <w:r>
+        <w:t xml:space="preserve">Open the windows of my coming old age,</w:t>
+      </w:r>
+      <w:r>
+        <w:br/>
+      </w:r>
+      <w:r>
+        <w:t xml:space="preserve">and hear the divine troupe,</w:t>
+      </w:r>
+      <w:r>
+        <w:br/>
+      </w:r>
+      <w:r>
+        <w:t xml:space="preserve">with exquisite music and laughter,</w:t>
+      </w:r>
+      <w:r>
+        <w:br/>
+      </w:r>
+      <w:r>
+        <w:t xml:space="preserve">pass under my window?</w:t>
+      </w:r>
+    </w:p>
+    <w:p>
+      <w:pPr>
+        <w:pStyle w:val="BodyText"/>
+      </w:pPr>
+      <w:r>
+        <w:t xml:space="preserve">Shall I say goodbye to Paris’s hotels?</w:t>
+      </w:r>
+      <w:r>
+        <w:br/>
+      </w:r>
+      <w:r>
+        <w:t xml:space="preserve">To the beautifully ugly flophouse of our first night,</w:t>
+      </w:r>
+      <w:r>
+        <w:br/>
+      </w:r>
+      <w:r>
+        <w:t xml:space="preserve">and to the room full of carpets and mirrors, high in Montmartre,</w:t>
+      </w:r>
+      <w:r>
+        <w:br/>
+      </w:r>
+      <w:r>
+        <w:t xml:space="preserve">to that rundown hotel, glorious in its decay,</w:t>
+      </w:r>
+      <w:r>
+        <w:br/>
+      </w:r>
+      <w:r>
+        <w:t xml:space="preserve">where an old waiter asked us, each morning,</w:t>
+      </w:r>
+      <w:r>
+        <w:br/>
+      </w:r>
+      <w:r>
+        <w:t xml:space="preserve">if we had enjoyed our croissant?</w:t>
+      </w:r>
+    </w:p>
+    <w:p>
+      <w:pPr>
+        <w:pStyle w:val="BodyText"/>
+      </w:pPr>
+      <w:r>
+        <w:t xml:space="preserve">Shall I say goodbye</w:t>
+      </w:r>
+      <w:r>
+        <w:br/>
+      </w:r>
+      <w:r>
+        <w:t xml:space="preserve">to the packed places where the four of us slept,</w:t>
+      </w:r>
+      <w:r>
+        <w:br/>
+      </w:r>
+      <w:r>
+        <w:t xml:space="preserve">each one identical to the others,</w:t>
+      </w:r>
+      <w:r>
+        <w:br/>
+      </w:r>
+      <w:r>
+        <w:t xml:space="preserve">in those years when time did not seem to flow?</w:t>
+      </w:r>
+    </w:p>
+    <w:p>
+      <w:pPr>
+        <w:pStyle w:val="BodyText"/>
+      </w:pPr>
+      <w:r>
+        <w:t xml:space="preserve">Shall I say goodbye to my children’s laughter,</w:t>
+      </w:r>
+      <w:r>
+        <w:br/>
+      </w:r>
+      <w:r>
+        <w:t xml:space="preserve">to the music that played</w:t>
+      </w:r>
+      <w:r>
+        <w:br/>
+      </w:r>
+      <w:r>
+        <w:t xml:space="preserve">in our car, even more packed</w:t>
+      </w:r>
+      <w:r>
+        <w:br/>
+      </w:r>
+      <w:r>
+        <w:t xml:space="preserve">than our hotel rooms,</w:t>
+      </w:r>
+      <w:r>
+        <w:br/>
+      </w:r>
+      <w:r>
+        <w:t xml:space="preserve">with Mom and Dad and Children and Bird,</w:t>
+      </w:r>
+      <w:r>
+        <w:br/>
+      </w:r>
+      <w:r>
+        <w:t xml:space="preserve">oh yes, and Bacchus too,</w:t>
+      </w:r>
+      <w:r>
+        <w:br/>
+      </w:r>
+      <w:r>
+        <w:t xml:space="preserve">the God who shared our rides and our walks</w:t>
+      </w:r>
+      <w:r>
+        <w:br/>
+      </w:r>
+      <w:r>
+        <w:t xml:space="preserve">through the streets of Paris at night?</w:t>
+      </w:r>
+    </w:p>
+    <w:p>
+      <w:pPr>
+        <w:pStyle w:val="BodyText"/>
+      </w:pPr>
+      <w:r>
+        <w:t xml:space="preserve">Shall I say goodbye? Is that all?</w:t>
+      </w:r>
+      <w:r>
+        <w:br/>
+      </w:r>
+      <w:r>
+        <w:t xml:space="preserve">Part with Paris,</w:t>
+      </w:r>
+      <w:r>
+        <w:br/>
+      </w:r>
+      <w:r>
+        <w:t xml:space="preserve">as Antony parted with Alexandria?</w:t>
+      </w:r>
+    </w:p>
+    <w:p>
+      <w:pPr>
+        <w:pStyle w:val="BodyText"/>
+      </w:pPr>
+      <w:r>
+        <w:t xml:space="preserve">Shall I accept, bravely, without regret, the inevitable departure of the God?</w:t>
+      </w:r>
+    </w:p>
+    <w:p>
+      <w:pPr>
+        <w:pStyle w:val="BodyText"/>
+      </w:pPr>
+      <w:r>
+        <w:t xml:space="preserve">Or say no, refuse, cling like a shipwrecked man to the last floating wood of love,</w:t>
+      </w:r>
+    </w:p>
+    <w:p>
+      <w:pPr>
+        <w:pStyle w:val="BodyText"/>
+      </w:pPr>
+      <w:r>
+        <w:t xml:space="preserve">and rage, rage against the dying of the light?</w:t>
+      </w:r>
+    </w:p>
+    <w:bookmarkEnd w:id="16"/>
+    <w:bookmarkStart w:id="17" w:name="the-clochard"/>
+    <w:p>
+      <w:pPr>
+        <w:pStyle w:val="Heading2"/>
+      </w:pPr>
+      <w:r>
         <w:t xml:space="preserve">The clochard</w:t>
       </w:r>
     </w:p>
@@ -1310,13 +1510,13 @@
         <w:pStyle w:val="FirstParagraph"/>
       </w:pPr>
       <w:r>
-        <w:t xml:space="preserve">The clochard who sleeps under the doorway</w:t>
-      </w:r>
-      <w:r>
-        <w:br/>
-      </w:r>
-      <w:r>
-        <w:t xml:space="preserve">of that building in the Montparnasse boulevard,</w:t>
+        <w:t xml:space="preserve">The clochard who sleeps in the doorway</w:t>
+      </w:r>
+      <w:r>
+        <w:br/>
+      </w:r>
+      <w:r>
+        <w:t xml:space="preserve">of that building on Boulevard du Montparnasse</w:t>
       </w:r>
       <w:r>
         <w:br/>
@@ -1348,25 +1548,25 @@
         <w:br/>
       </w:r>
       <w:r>
-        <w:t xml:space="preserve">over the grids of the subway venting grids,</w:t>
-      </w:r>
-      <w:r>
-        <w:br/>
-      </w:r>
-      <w:r>
-        <w:t xml:space="preserve">barefoot, whitebearded, a bottle of vodka at hand,</w:t>
-      </w:r>
-      <w:r>
-        <w:br/>
-      </w:r>
-      <w:r>
-        <w:t xml:space="preserve">warmed by the alcohol and the fumes from the underground,</w:t>
-      </w:r>
-      <w:r>
-        <w:br/>
-      </w:r>
-      <w:r>
-        <w:t xml:space="preserve">his books keep him company.</w:t>
+        <w:t xml:space="preserve">on the subway grates,</w:t>
+      </w:r>
+      <w:r>
+        <w:br/>
+      </w:r>
+      <w:r>
+        <w:t xml:space="preserve">barefoot, white-bearded, a bottle of vodka at hand,</w:t>
+      </w:r>
+      <w:r>
+        <w:br/>
+      </w:r>
+      <w:r>
+        <w:t xml:space="preserve">warmed by the alcohol and the fumes from the underground.</w:t>
+      </w:r>
+      <w:r>
+        <w:br/>
+      </w:r>
+      <w:r>
+        <w:t xml:space="preserve">His books keep him company.</w:t>
       </w:r>
     </w:p>
     <w:p>
@@ -1380,13 +1580,13 @@
         <w:br/>
       </w:r>
       <w:r>
-        <w:t xml:space="preserve">as if searching for the meaning of life,</w:t>
-      </w:r>
-      <w:r>
-        <w:br/>
-      </w:r>
-      <w:r>
-        <w:t xml:space="preserve">some times he reads,</w:t>
+        <w:t xml:space="preserve">as if searching for the meaning of life.</w:t>
+      </w:r>
+      <w:r>
+        <w:br/>
+      </w:r>
+      <w:r>
+        <w:t xml:space="preserve">Sometimes he reads,</w:t>
       </w:r>
       <w:r>
         <w:br/>
@@ -1400,22 +1600,22 @@
         <w:pStyle w:val="BodyText"/>
       </w:pPr>
       <w:r>
-        <w:t xml:space="preserve">Nearby the tourists,</w:t>
-      </w:r>
-      <w:r>
-        <w:br/>
-      </w:r>
-      <w:r>
-        <w:t xml:space="preserve">expend the money he need to survive a full month,</w:t>
-      </w:r>
-      <w:r>
-        <w:br/>
-      </w:r>
-      <w:r>
-        <w:t xml:space="preserve">in a ticket to the modernist museum.</w:t>
-      </w:r>
-    </w:p>
-    <w:bookmarkEnd w:id="16"/>
+        <w:t xml:space="preserve">Nearby, tourists</w:t>
+      </w:r>
+      <w:r>
+        <w:br/>
+      </w:r>
+      <w:r>
+        <w:t xml:space="preserve">spend on a ticket to the modernist museum</w:t>
+      </w:r>
+      <w:r>
+        <w:br/>
+      </w:r>
+      <w:r>
+        <w:t xml:space="preserve">what he needs to survive for a full month.</w:t>
+      </w:r>
+    </w:p>
+    <w:bookmarkEnd w:id="17"/>
     <w:sectPr>
       <w:footnotePr>
         <w:numRestart w:val="eachSect"/>

</xml_diff>